<commit_message>
Fix spelling, grammar and punctuation errors in Chapter 9 - Maze.docx
</commit_message>
<xml_diff>
--- a/Chapter 9 - Maze.docx
+++ b/Chapter 9 - Maze.docx
@@ -16,7 +16,19 @@
         <w:pStyle w:val="FirstParagraph"/>
       </w:pPr>
       <w:r>
-        <w:t xml:space="preserve">For a moment Klee wondered if he knew anything about exploring mazes. He’d heard – what was it? – you keep a hand on one wall and just keep walking? But then he realised, all he had to do was follow Mrs Ting.</w:t>
+        <w:t xml:space="preserve">For a moment Klee wondered if he knew anything about exploring mazes.</w:t>
+      </w:r>
+      <w:r>
+        <w:t xml:space="preserve"> </w:t>
+      </w:r>
+      <w:r>
+        <w:t xml:space="preserve">He’d heard – what was it? – you keep a hand on one wall and just keep</w:t>
+      </w:r>
+      <w:r>
+        <w:t xml:space="preserve"> </w:t>
+      </w:r>
+      <w:r>
+        <w:t xml:space="preserve">walking? But then he realised, all he had to do was follow Mrs Ting.</w:t>
       </w:r>
     </w:p>
     <w:p>
@@ -61,7 +73,13 @@
         <w:t xml:space="preserve">“</w:t>
       </w:r>
       <w:r>
-        <w:t xml:space="preserve">The fire extinguishers. I used to get lost – I mean it’s like a maze in here.</w:t>
+        <w:t xml:space="preserve">The fire extinguishers. I used to get lost – I mean it’s like a maze</w:t>
+      </w:r>
+      <w:r>
+        <w:t xml:space="preserve"> </w:t>
+      </w:r>
+      <w:r>
+        <w:t xml:space="preserve">in here.</w:t>
       </w:r>
       <w:r>
         <w:t xml:space="preserve">”</w:t>
@@ -117,7 +135,7 @@
         <w:t xml:space="preserve">“</w:t>
       </w:r>
       <w:r>
-        <w:t xml:space="preserve">Ooh I don’t know, he never said.</w:t>
+        <w:t xml:space="preserve">Ooh, I don’t know, he never said.</w:t>
       </w:r>
       <w:r>
         <w:t xml:space="preserve">”</w:t>
@@ -145,7 +163,13 @@
         <w:t xml:space="preserve">“</w:t>
       </w:r>
       <w:r>
-        <w:t xml:space="preserve">Must have been, well, it was just after our Lilly was born. And my Jimmy was still alive.</w:t>
+        <w:t xml:space="preserve">Must have been, well, it was just after our Lilly was born. And my</w:t>
+      </w:r>
+      <w:r>
+        <w:t xml:space="preserve"> </w:t>
+      </w:r>
+      <w:r>
+        <w:t xml:space="preserve">Jimmy was still alive.</w:t>
       </w:r>
       <w:r>
         <w:t xml:space="preserve">”</w:t>
@@ -212,46 +236,99 @@
         <w:pStyle w:val="BodyText"/>
       </w:pPr>
       <w:r>
-        <w:t xml:space="preserve">All the time they were talking they were walking. Mrs Ting was moving at a pace. She didn’t seem to be looking at the fire extinguishers. But he noticed that she was following their logic. Always taking a turn where one was placed.</w:t>
-      </w:r>
-    </w:p>
-    <w:p>
-      <w:r>
-        <w:pict>
-          <v:rect style="width:0;height:1.5pt" o:hralign="center" o:hrstd="t" o:hr="t"/>
-        </w:pict>
-      </w:r>
-    </w:p>
-    <w:p>
-      <w:pPr>
-        <w:pStyle w:val="FirstParagraph"/>
-      </w:pPr>
-      <w:r>
-        <w:t xml:space="preserve">They came out into what was clearly the middle of the maze. A large leather-topped desk and a chair. A sideboard. With a drinks tray and all the equipment to make tea and coffee, a kettle and the water container.</w:t>
-      </w:r>
-    </w:p>
-    <w:p>
-      <w:pPr>
-        <w:pStyle w:val="BodyText"/>
-      </w:pPr>
-      <w:r>
-        <w:t xml:space="preserve">An enormous space, thought Klee. With just two chairs. Both of them for Boht. It didn’t look like he ever expected company.</w:t>
-      </w:r>
-    </w:p>
-    <w:p>
-      <w:pPr>
-        <w:pStyle w:val="BodyText"/>
-      </w:pPr>
-      <w:r>
-        <w:t xml:space="preserve">He was following Mrs Ting at speed. But he was ready for a sit down. He was also interested to have more of a look around at the things on the shelves in front of the books that surrounded Boht’s desk – this was his office wasn’t it?</w:t>
-      </w:r>
-    </w:p>
-    <w:p>
-      <w:pPr>
-        <w:pStyle w:val="BodyText"/>
-      </w:pPr>
-      <w:r>
-        <w:t xml:space="preserve">But Mrs Ting didn’t seem to want to stop. She was sort of lightly jogging on the spot.</w:t>
+        <w:t xml:space="preserve">All the time they were talking they were walking. Mrs Ting was moving at</w:t>
+      </w:r>
+      <w:r>
+        <w:t xml:space="preserve"> </w:t>
+      </w:r>
+      <w:r>
+        <w:t xml:space="preserve">a pace. She didn’t seem to be looking at the fire extinguishers. But he</w:t>
+      </w:r>
+      <w:r>
+        <w:t xml:space="preserve"> </w:t>
+      </w:r>
+      <w:r>
+        <w:t xml:space="preserve">noticed that she was following their logic. Always taking a turn where</w:t>
+      </w:r>
+      <w:r>
+        <w:t xml:space="preserve"> </w:t>
+      </w:r>
+      <w:r>
+        <w:t xml:space="preserve">one was placed.</w:t>
+      </w:r>
+    </w:p>
+    <w:p>
+      <w:pPr>
+        <w:pStyle w:val="BodyText"/>
+      </w:pPr>
+      <w:r>
+        <w:t xml:space="preserve">They came out into what was clearly the middle of the maze. A large</w:t>
+      </w:r>
+      <w:r>
+        <w:t xml:space="preserve"> </w:t>
+      </w:r>
+      <w:r>
+        <w:t xml:space="preserve">leather-topped desk and a chair. A sideboard. With a drinks tray and all</w:t>
+      </w:r>
+      <w:r>
+        <w:t xml:space="preserve"> </w:t>
+      </w:r>
+      <w:r>
+        <w:t xml:space="preserve">the equipment to make tea and coffee, a kettle and the water container.</w:t>
+      </w:r>
+    </w:p>
+    <w:p>
+      <w:pPr>
+        <w:pStyle w:val="BodyText"/>
+      </w:pPr>
+      <w:r>
+        <w:t xml:space="preserve">An enormous space, thought Klee. With just two chairs. Both of them for</w:t>
+      </w:r>
+      <w:r>
+        <w:t xml:space="preserve"> </w:t>
+      </w:r>
+      <w:r>
+        <w:t xml:space="preserve">Boht. It didn’t look like he ever expected company.</w:t>
+      </w:r>
+    </w:p>
+    <w:p>
+      <w:pPr>
+        <w:pStyle w:val="BodyText"/>
+      </w:pPr>
+      <w:r>
+        <w:t xml:space="preserve">He was following Mrs Ting at speed. But he was ready for a sit down. He</w:t>
+      </w:r>
+      <w:r>
+        <w:t xml:space="preserve"> </w:t>
+      </w:r>
+      <w:r>
+        <w:t xml:space="preserve">was also interested to have more of a look around at the things on the</w:t>
+      </w:r>
+      <w:r>
+        <w:t xml:space="preserve"> </w:t>
+      </w:r>
+      <w:r>
+        <w:t xml:space="preserve">shelves in front of the books that surrounded Boht’s desk – this was</w:t>
+      </w:r>
+      <w:r>
+        <w:t xml:space="preserve"> </w:t>
+      </w:r>
+      <w:r>
+        <w:t xml:space="preserve">his office, wasn’t it?</w:t>
+      </w:r>
+    </w:p>
+    <w:p>
+      <w:pPr>
+        <w:pStyle w:val="BodyText"/>
+      </w:pPr>
+      <w:r>
+        <w:t xml:space="preserve">But Mrs Ting didn’t seem to want to stop. She was sort of lightly</w:t>
+      </w:r>
+      <w:r>
+        <w:t xml:space="preserve"> </w:t>
+      </w:r>
+      <w:r>
+        <w:t xml:space="preserve">jogging on the spot.</w:t>
       </w:r>
       <w:r>
         <w:t xml:space="preserve"> </w:t>
@@ -288,16 +365,34 @@
         <w:t xml:space="preserve">“</w:t>
       </w:r>
       <w:r>
-        <w:t xml:space="preserve">Yes, there’s a back door. He didn’t use it much. But if you’re staying here, you probably need to know where the back door is – you know, like, in case of</w:t>
-      </w:r>
-      <w:r>
-        <w:t xml:space="preserve">”</w:t>
-      </w:r>
-      <w:r>
-        <w:t xml:space="preserve"> </w:t>
-      </w:r>
-      <w:r>
-        <w:t xml:space="preserve">– she searched for a word and he realised that he didn’t have any good idea what that word might be –</w:t>
+        <w:t xml:space="preserve">Yes, there’s a back door. He didn’t use it much. But if you’re staying</w:t>
+      </w:r>
+      <w:r>
+        <w:t xml:space="preserve"> </w:t>
+      </w:r>
+      <w:r>
+        <w:t xml:space="preserve">here, you probably need to know where the back door is – you know,</w:t>
+      </w:r>
+      <w:r>
+        <w:t xml:space="preserve"> </w:t>
+      </w:r>
+      <w:r>
+        <w:t xml:space="preserve">like, in case of</w:t>
+      </w:r>
+      <w:r>
+        <w:t xml:space="preserve">”</w:t>
+      </w:r>
+      <w:r>
+        <w:t xml:space="preserve"> </w:t>
+      </w:r>
+      <w:r>
+        <w:t xml:space="preserve">– she searched for a word and he realised that he</w:t>
+      </w:r>
+      <w:r>
+        <w:t xml:space="preserve"> </w:t>
+      </w:r>
+      <w:r>
+        <w:t xml:space="preserve">didn’t have any good idea what that word might be –</w:t>
       </w:r>
       <w:r>
         <w:t xml:space="preserve"> </w:t>
@@ -315,23 +410,77 @@
         <w:t xml:space="preserve"> </w:t>
       </w:r>
       <w:r>
-        <w:t xml:space="preserve">she said, eventually.</w:t>
-      </w:r>
-    </w:p>
-    <w:p>
-      <w:pPr>
-        <w:pStyle w:val="BodyText"/>
-      </w:pPr>
-      <w:r>
-        <w:t xml:space="preserve">And off she went – past another fire extinguisher to her left. In the middle, he could see the ceiling. He realised that up to that point, he hadn’t seen the ceiling. The corridors of the bookshelves were covered in some kind of semi-translucent material – he guessed it was to protect the books. But it added to the murky experience of trying to find your way around the maze.</w:t>
-      </w:r>
-    </w:p>
-    <w:p>
-      <w:pPr>
-        <w:pStyle w:val="BodyText"/>
-      </w:pPr>
-      <w:r>
-        <w:t xml:space="preserve">Now he was pretty comfortable that he’d got the fire extinguisher system for finding his way down. He didn’t feel the need to chase after Mrs Ting quite so closely, but he increased his speed when he heard her scream.</w:t>
+        <w:t xml:space="preserve">she</w:t>
+      </w:r>
+      <w:r>
+        <w:t xml:space="preserve"> </w:t>
+      </w:r>
+      <w:r>
+        <w:t xml:space="preserve">said, eventually.</w:t>
+      </w:r>
+    </w:p>
+    <w:p>
+      <w:pPr>
+        <w:pStyle w:val="BodyText"/>
+      </w:pPr>
+      <w:r>
+        <w:t xml:space="preserve">And off she went – past another fire extinguisher to her left. In the</w:t>
+      </w:r>
+      <w:r>
+        <w:t xml:space="preserve"> </w:t>
+      </w:r>
+      <w:r>
+        <w:t xml:space="preserve">middle, he could see the ceiling. He realised that up to that point, he</w:t>
+      </w:r>
+      <w:r>
+        <w:t xml:space="preserve"> </w:t>
+      </w:r>
+      <w:r>
+        <w:t xml:space="preserve">hadn’t seen the ceiling. The corridors of the bookshelves were covered</w:t>
+      </w:r>
+      <w:r>
+        <w:t xml:space="preserve"> </w:t>
+      </w:r>
+      <w:r>
+        <w:t xml:space="preserve">in some kind of semi-translucent material – he guessed it was to</w:t>
+      </w:r>
+      <w:r>
+        <w:t xml:space="preserve"> </w:t>
+      </w:r>
+      <w:r>
+        <w:t xml:space="preserve">protect the books. But it added to the murky experience of trying to</w:t>
+      </w:r>
+      <w:r>
+        <w:t xml:space="preserve"> </w:t>
+      </w:r>
+      <w:r>
+        <w:t xml:space="preserve">find your way around the maze.</w:t>
+      </w:r>
+    </w:p>
+    <w:p>
+      <w:pPr>
+        <w:pStyle w:val="BodyText"/>
+      </w:pPr>
+      <w:r>
+        <w:t xml:space="preserve">Now he was pretty comfortable that he’d got the fire extinguisher system</w:t>
+      </w:r>
+      <w:r>
+        <w:t xml:space="preserve"> </w:t>
+      </w:r>
+      <w:r>
+        <w:t xml:space="preserve">for finding his way down. He didn’t feel the need to chase after Mrs</w:t>
+      </w:r>
+      <w:r>
+        <w:t xml:space="preserve"> </w:t>
+      </w:r>
+      <w:r>
+        <w:t xml:space="preserve">Ting quite so closely, but he increased his speed when he heard her</w:t>
+      </w:r>
+      <w:r>
+        <w:t xml:space="preserve"> </w:t>
+      </w:r>
+      <w:r>
+        <w:t xml:space="preserve">scream.</w:t>
       </w:r>
     </w:p>
     <w:p>
@@ -381,22 +530,51 @@
         <w:pStyle w:val="BodyText"/>
       </w:pPr>
       <w:r>
-        <w:t xml:space="preserve">Of course he quickened his pace. The final corridor of books and bookshelves led him to an entrance hall. And to a set of double doors, which had clearly been jimmied or smashed open from the outside.</w:t>
-      </w:r>
-    </w:p>
-    <w:p>
-      <w:r>
-        <w:pict>
-          <v:rect style="width:0;height:1.5pt" o:hralign="center" o:hrstd="t" o:hr="t"/>
-        </w:pict>
-      </w:r>
-    </w:p>
-    <w:p>
-      <w:pPr>
-        <w:pStyle w:val="FirstParagraph"/>
-      </w:pPr>
-      <w:r>
-        <w:t xml:space="preserve">What was even weirder was that it look like it had happened very recently. The splintered wood on the door jamb was bright and clean. Another clue that it had just happened was the two men clad in black that were running across the large lawn that the emergency exit doors led out to.</w:t>
+        <w:t xml:space="preserve">Of course he quickened his pace. The final corridor of books and</w:t>
+      </w:r>
+      <w:r>
+        <w:t xml:space="preserve"> </w:t>
+      </w:r>
+      <w:r>
+        <w:t xml:space="preserve">bookshelves led him to an entrance hall. And to a set of double doors,</w:t>
+      </w:r>
+      <w:r>
+        <w:t xml:space="preserve"> </w:t>
+      </w:r>
+      <w:r>
+        <w:t xml:space="preserve">which had clearly been jimmied or smashed open from the outside.</w:t>
+      </w:r>
+    </w:p>
+    <w:p>
+      <w:pPr>
+        <w:pStyle w:val="BodyText"/>
+      </w:pPr>
+      <w:r>
+        <w:t xml:space="preserve">What was even weirder was that it looked like it had happened very</w:t>
+      </w:r>
+      <w:r>
+        <w:t xml:space="preserve"> </w:t>
+      </w:r>
+      <w:r>
+        <w:t xml:space="preserve">recently. The splintered wood on the door jamb was bright and clean.</w:t>
+      </w:r>
+      <w:r>
+        <w:t xml:space="preserve"> </w:t>
+      </w:r>
+      <w:r>
+        <w:t xml:space="preserve">Another clue that it had just happened was the two men clad in black</w:t>
+      </w:r>
+      <w:r>
+        <w:t xml:space="preserve"> </w:t>
+      </w:r>
+      <w:r>
+        <w:t xml:space="preserve">that were running across the large lawn that the emergency exit doors</w:t>
+      </w:r>
+      <w:r>
+        <w:t xml:space="preserve"> </w:t>
+      </w:r>
+      <w:r>
+        <w:t xml:space="preserve">led out to.</w:t>
       </w:r>
     </w:p>
     <w:p>
@@ -422,7 +600,13 @@
         <w:t xml:space="preserve"> </w:t>
       </w:r>
       <w:r>
-        <w:t xml:space="preserve">Black tracksuit bottoms, black body warmers. Black balaclavas.</w:t>
+        <w:t xml:space="preserve">Black tracksuit</w:t>
+      </w:r>
+      <w:r>
+        <w:t xml:space="preserve"> </w:t>
+      </w:r>
+      <w:r>
+        <w:t xml:space="preserve">bottoms, black body warmers. Black balaclavas.</w:t>
       </w:r>
     </w:p>
     <w:p>
@@ -438,37 +622,108 @@
         <w:pStyle w:val="BodyText"/>
       </w:pPr>
       <w:r>
-        <w:t xml:space="preserve">Maybe Ernesto Klee hadn’t learned much from his time in the Met. But he had learned that if you were going to chase someone, it was a very bad idea to shout and let them know. They were gently trotting across the lawn – yes, the sound of Mrs Ting talking had spooked them probably. But it was only when Mrs Ting shouted</w:t>
-      </w:r>
-      <w:r>
-        <w:t xml:space="preserve"> </w:t>
-      </w:r>
-      <w:r>
-        <w:t xml:space="preserve">“</w:t>
-      </w:r>
-      <w:r>
-        <w:t xml:space="preserve">We’ll get you, you German bastards!</w:t>
-      </w:r>
-      <w:r>
-        <w:t xml:space="preserve">”</w:t>
-      </w:r>
-      <w:r>
-        <w:t xml:space="preserve"> </w:t>
-      </w:r>
-      <w:r>
-        <w:t xml:space="preserve">that they realised they’d actually been spotted and picked up their pace. Klee realised that his chances of catching them were now pretty slim. Especially because he realised, he knew the area hardly at all. He was also alarmed to see how quickly they were getting over the wall at the end of the garden. It was only when he reached it himself he realised that there were stone steps, like those in a stile, built into the wall. But – and he only really understood this when he reached the top – only on one side. Getting down the other side meant he was going to have to jump.</w:t>
-      </w:r>
-    </w:p>
-    <w:p>
-      <w:r>
-        <w:pict>
-          <v:rect style="width:0;height:1.5pt" o:hralign="center" o:hrstd="t" o:hr="t"/>
-        </w:pict>
-      </w:r>
-    </w:p>
-    <w:p>
-      <w:pPr>
-        <w:pStyle w:val="FirstParagraph"/>
+        <w:t xml:space="preserve">Maybe Ernesto Klee hadn’t learned much from his time in the Met. But he</w:t>
+      </w:r>
+      <w:r>
+        <w:t xml:space="preserve"> </w:t>
+      </w:r>
+      <w:r>
+        <w:t xml:space="preserve">had learned that if you were going to chase someone, it was a very bad</w:t>
+      </w:r>
+      <w:r>
+        <w:t xml:space="preserve"> </w:t>
+      </w:r>
+      <w:r>
+        <w:t xml:space="preserve">idea to shout and let them know. They were gently trotting across the</w:t>
+      </w:r>
+      <w:r>
+        <w:t xml:space="preserve"> </w:t>
+      </w:r>
+      <w:r>
+        <w:t xml:space="preserve">lawn – yes, the sound of Mrs Ting talking had spooked them probably.</w:t>
+      </w:r>
+      <w:r>
+        <w:t xml:space="preserve"> </w:t>
+      </w:r>
+      <w:r>
+        <w:t xml:space="preserve">But it was only when Mrs Ting shouted</w:t>
+      </w:r>
+      <w:r>
+        <w:t xml:space="preserve"> </w:t>
+      </w:r>
+      <w:r>
+        <w:t xml:space="preserve">“</w:t>
+      </w:r>
+      <w:r>
+        <w:t xml:space="preserve">We’ll get you, you German</w:t>
+      </w:r>
+      <w:r>
+        <w:t xml:space="preserve"> </w:t>
+      </w:r>
+      <w:r>
+        <w:t xml:space="preserve">bastards!</w:t>
+      </w:r>
+      <w:r>
+        <w:t xml:space="preserve">”</w:t>
+      </w:r>
+      <w:r>
+        <w:t xml:space="preserve"> </w:t>
+      </w:r>
+      <w:r>
+        <w:t xml:space="preserve">that they realised they’d actually been spotted and picked up</w:t>
+      </w:r>
+      <w:r>
+        <w:t xml:space="preserve"> </w:t>
+      </w:r>
+      <w:r>
+        <w:t xml:space="preserve">their pace. Klee realised that his chances of catching them were now</w:t>
+      </w:r>
+      <w:r>
+        <w:t xml:space="preserve"> </w:t>
+      </w:r>
+      <w:r>
+        <w:t xml:space="preserve">pretty slim. Especially because he realised, he knew the area hardly at</w:t>
+      </w:r>
+      <w:r>
+        <w:t xml:space="preserve"> </w:t>
+      </w:r>
+      <w:r>
+        <w:t xml:space="preserve">all. He was also alarmed to see how quickly they were getting over the</w:t>
+      </w:r>
+      <w:r>
+        <w:t xml:space="preserve"> </w:t>
+      </w:r>
+      <w:r>
+        <w:t xml:space="preserve">wall at the end of the garden. It was only when he reached it himself that he</w:t>
+      </w:r>
+      <w:r>
+        <w:t xml:space="preserve"> </w:t>
+      </w:r>
+      <w:r>
+        <w:t xml:space="preserve">realised that there were stone steps, like those in a stile, built into</w:t>
+      </w:r>
+      <w:r>
+        <w:t xml:space="preserve"> </w:t>
+      </w:r>
+      <w:r>
+        <w:t xml:space="preserve">the wall. But – and he only really understood this when he reached the</w:t>
+      </w:r>
+      <w:r>
+        <w:t xml:space="preserve"> </w:t>
+      </w:r>
+      <w:r>
+        <w:t xml:space="preserve">top – only on one side. Getting down the other side meant he was going</w:t>
+      </w:r>
+      <w:r>
+        <w:t xml:space="preserve"> </w:t>
+      </w:r>
+      <w:r>
+        <w:t xml:space="preserve">to have to jump.</w:t>
+      </w:r>
+    </w:p>
+    <w:p>
+      <w:pPr>
+        <w:pStyle w:val="BodyText"/>
       </w:pPr>
       <w:r>
         <w:t xml:space="preserve">“</w:t>
@@ -491,7 +746,61 @@
         <w:pStyle w:val="BodyText"/>
       </w:pPr>
       <w:r>
-        <w:t xml:space="preserve">What had happened to him was that he’d taken the time to walk along the wall to a point where he thought he might have a chance at a soft-ish landing. He’d paused again. He’d realised immediately that he was wrong about the soft landing. Trying to console himself that he probably didn’t need both hips, he’d managed to limp into an upright position and looked both ways down the road that he’d found himself, covered in soil and leaf mould down one aching side, standing on. It was suburban semis in both directions. With no sign of any movement but in the middle distance the sound of the accelerator being floored in the kind of car that had deliberately not silenced exhausts.</w:t>
+        <w:t xml:space="preserve">What had happened to him was that he’d taken the time to walk along the</w:t>
+      </w:r>
+      <w:r>
+        <w:t xml:space="preserve"> </w:t>
+      </w:r>
+      <w:r>
+        <w:t xml:space="preserve">wall to a point where he thought he might have a chance at a soft-ish</w:t>
+      </w:r>
+      <w:r>
+        <w:t xml:space="preserve"> </w:t>
+      </w:r>
+      <w:r>
+        <w:t xml:space="preserve">landing. He’d paused again. He’d realised immediately that he was wrong</w:t>
+      </w:r>
+      <w:r>
+        <w:t xml:space="preserve"> </w:t>
+      </w:r>
+      <w:r>
+        <w:t xml:space="preserve">about the soft landing. Trying to console himself that he probably</w:t>
+      </w:r>
+      <w:r>
+        <w:t xml:space="preserve"> </w:t>
+      </w:r>
+      <w:r>
+        <w:t xml:space="preserve">didn’t need both hips, he’d managed to limp into an upright position and</w:t>
+      </w:r>
+      <w:r>
+        <w:t xml:space="preserve"> </w:t>
+      </w:r>
+      <w:r>
+        <w:t xml:space="preserve">looked both ways down the road that he’d found himself, covered in soil</w:t>
+      </w:r>
+      <w:r>
+        <w:t xml:space="preserve"> </w:t>
+      </w:r>
+      <w:r>
+        <w:t xml:space="preserve">and leaf mould down one aching side, standing on. It was suburban semis</w:t>
+      </w:r>
+      <w:r>
+        <w:t xml:space="preserve"> </w:t>
+      </w:r>
+      <w:r>
+        <w:t xml:space="preserve">in both directions. With no sign of any movement but in the middle</w:t>
+      </w:r>
+      <w:r>
+        <w:t xml:space="preserve"> </w:t>
+      </w:r>
+      <w:r>
+        <w:t xml:space="preserve">distance the sound of the accelerator being floored in the kind of car</w:t>
+      </w:r>
+      <w:r>
+        <w:t xml:space="preserve"> </w:t>
+      </w:r>
+      <w:r>
+        <w:t xml:space="preserve">that had deliberately not silenced exhausts.</w:t>
       </w:r>
     </w:p>
     <w:bookmarkEnd w:id="20"/>

</xml_diff>